<commit_message>
consolidation: clean repo, GRID pipeline, sync coursework chapters & docx
</commit_message>
<xml_diff>
--- a/docs/coursework/курсовая_работа.docx
+++ b/docs/coursework/курсовая_работа.docx
@@ -2467,12 +2467,17 @@
         <w:pStyle w:val="Heading3"/>
       </w:pPr>
       <w:r>
-        <w:t>4.1.1. Датасет</w:t>
+        <w:t>4.1.1. Датасет: GRID Corpus</w:t>
       </w:r>
     </w:p>
     <w:p>
       <w:r>
-        <w:t>В качестве основного датасета используется MUAVIC (Multilingual Audio-Visual Corpus, английская часть). MUAVIC построен на основе mTEDx — корпуса TED-докладов с видеорядом, синхронизированным с речью — и распространяется в открытом доступе (лицензия Creative Commons Attribution-NonCommercial 4.0). С учётом ограничений вычислительных ресурсов для обучения использовалось подмножество объёмом около 10 часов для обучающей выборки и 1 час для валидации.</w:t>
+        <w:t>В качестве основного датасета используется GRID Corpus (Cooke et al., 2006) — открытый аудио-визуальный корпус, специально созданный для исследований визуального и аудио-визуального распознавания речи. GRID содержит 33 спикера, каждый из которых произнёс 1000 предложений фиксированной грамматической структуры: «команда — цвет — предлог — буква — цифра — наречие», например «bin blue at f two now». Видеозаписи сделаны во фронтальной проекции на белом фоне с ровным освещением (720×576, 25 FPS), что обеспечивает практически идеальные условия для извлечения области губ MediaPipe-детектором. Аудио закодировано внутри видеоконтейнера .mpg и извлекается через ffmpeg с ресэмплингом до 16 кГц.</w:t>
+      </w:r>
+    </w:p>
+    <w:p>
+      <w:r>
+        <w:t>GRID был использован в основополагающей работе LipNet (Assael et al., 2016) — первой end-to-end модели чтения по губам на уровне предложений. Использование GRID в настоящей работе обеспечивает прямую преемственность с этой работой и позволяет сосредоточиться на ключевой задаче — сравнении audio-only и аудио-визуальной моделей в чистых и зашумлённых условиях, не отвлекаясь на сложность языковой модели большого словаря.</w:t>
       </w:r>
     </w:p>
     <w:p>
@@ -2570,7 +2575,7 @@
                 <w:b/>
                 <w:sz w:val="24"/>
               </w:rPr>
-              <w:t>Описание</w:t>
+              <w:t>Спикеры</w:t>
             </w:r>
           </w:p>
         </w:tc>
@@ -2610,7 +2615,7 @@
                 <w:rFonts w:ascii="Times New Roman" w:hAnsi="Times New Roman"/>
                 <w:sz w:val="24"/>
               </w:rPr>
-              <w:t>~5 500</w:t>
+              <w:t>~9 000</w:t>
             </w:r>
           </w:p>
         </w:tc>
@@ -2629,7 +2634,7 @@
                 <w:rFonts w:ascii="Times New Roman" w:hAnsi="Times New Roman"/>
                 <w:sz w:val="24"/>
               </w:rPr>
-              <w:t>~8 часов</w:t>
+              <w:t>~7.5 часов</w:t>
             </w:r>
           </w:p>
         </w:tc>
@@ -2648,7 +2653,7 @@
                 <w:rFonts w:ascii="Times New Roman" w:hAnsi="Times New Roman"/>
                 <w:sz w:val="24"/>
               </w:rPr>
-              <w:t>TED-доклады для обучения</w:t>
+              <w:t>s1, s3-s10, s12 (10 спикеров)</w:t>
             </w:r>
           </w:p>
         </w:tc>
@@ -2669,7 +2674,7 @@
                 <w:rFonts w:ascii="Times New Roman" w:hAnsi="Times New Roman"/>
                 <w:sz w:val="24"/>
               </w:rPr>
-              <w:t>valid</w:t>
+              <w:t>val</w:t>
             </w:r>
           </w:p>
         </w:tc>
@@ -2688,7 +2693,7 @@
                 <w:rFonts w:ascii="Times New Roman" w:hAnsi="Times New Roman"/>
                 <w:sz w:val="24"/>
               </w:rPr>
-              <w:t>~1 300</w:t>
+              <w:t>~1 000</w:t>
             </w:r>
           </w:p>
         </w:tc>
@@ -2707,7 +2712,7 @@
                 <w:rFonts w:ascii="Times New Roman" w:hAnsi="Times New Roman"/>
                 <w:sz w:val="24"/>
               </w:rPr>
-              <w:t>~2 часа</w:t>
+              <w:t>~0.8 часа</w:t>
             </w:r>
           </w:p>
         </w:tc>
@@ -2726,7 +2731,7 @@
                 <w:rFonts w:ascii="Times New Roman" w:hAnsi="Times New Roman"/>
                 <w:sz w:val="24"/>
               </w:rPr>
-              <w:t>Валидация во время обучения</w:t>
+              <w:t>s2 (speaker-disjoint)</w:t>
             </w:r>
           </w:p>
         </w:tc>
@@ -2766,7 +2771,7 @@
                 <w:rFonts w:ascii="Times New Roman" w:hAnsi="Times New Roman"/>
                 <w:sz w:val="24"/>
               </w:rPr>
-              <w:t>~1 300</w:t>
+              <w:t>~1 000</w:t>
             </w:r>
           </w:p>
         </w:tc>
@@ -2785,7 +2790,7 @@
                 <w:rFonts w:ascii="Times New Roman" w:hAnsi="Times New Roman"/>
                 <w:sz w:val="24"/>
               </w:rPr>
-              <w:t>~2 часа</w:t>
+              <w:t>~0.8 часа</w:t>
             </w:r>
           </w:p>
         </w:tc>
@@ -2804,12 +2809,17 @@
                 <w:rFonts w:ascii="Times New Roman" w:hAnsi="Times New Roman"/>
                 <w:sz w:val="24"/>
               </w:rPr>
-              <w:t>Финальная оценка</w:t>
+              <w:t>s11 (speaker-disjoint)</w:t>
             </w:r>
           </w:p>
         </w:tc>
       </w:tr>
     </w:tbl>
+    <w:p>
+      <w:r>
+        <w:t>Разбиение speaker-disjoint (один и тот же спикер не попадает одновременно в train и val/test) — стандартная практика в AVSR, позволяющая оценивать обобщающую способность модели к новым говорящим, а не к новым произнесениям тех же говорящих.</w:t>
+      </w:r>
+    </w:p>
     <w:p>
       <w:pPr>
         <w:pStyle w:val="Heading3"/>
@@ -6836,7 +6846,7 @@
     </w:p>
     <w:p>
       <w:r>
-        <w:t>В рамках курсовой работы был использован значительно меньший объём данных, чем в эталонных академических исследованиях (около 10 часов против сотен часов в LRS3, AV-HuBERT, Auto-AVSR). Это привело к необходимости заморозить аудио-ветку (Whisper) и обучать только видео-энкодер и модуль слияния. Полученные результаты не следует сравнивать с state-of-the-art в области AVSR напрямую — они демонстрируют работоспособность подхода и корректность относительных сравнений (audio-only vs AV, concat vs cross-attention, устойчивость к шуму), но не претендуют на абсолютные значения качества современных промышленных систем.</w:t>
+        <w:t>В рамках курсовой работы был использован корпус GRID — стандартный датасет AVSR с узкой лексикой (51 слово) и фиксированной грамматикой. Это позволило получить чистый и интерпретируемый эксперимент по сравнению аудио-визуальной модели с audio-only базовой линией, но имеет два важных следствия: во-первых, полученные абсолютные значения WER не сопоставимы напрямую с результатами на open-vocabulary датасетах (LRS3, MUAVIC, AV-HuBERT, Auto-AVSR) — на GRID любая нетривиальная модель достигает низких WER именно из-за ограниченности словаря; во-вторых, относительные сравнения между моделями (audio-only vs AV, concat vs cross-attention, устойчивость к шуму) остаются валидными и составляют основной вклад настоящей работы. Дополнительно использовалась замороженная аудио-ветка на основе предобученного Whisper, что является обоснованным компромиссом в условиях ограниченных вычислительных ресурсов (бесплатный Colab T4).</w:t>
       </w:r>
     </w:p>
     <w:p>

</xml_diff>